<commit_message>
add link to report
</commit_message>
<xml_diff>
--- a/Lab2/Отчет_Лабораторная_2.docx
+++ b/Lab2/Отчет_Лабораторная_2.docx
@@ -450,8 +450,113 @@
           <w:color w:val="000000" w:themeColor="text1"/>
           <w:sz w:val="20"/>
           <w:szCs w:val="20"/>
+          <w:lang w:val="ru-RU"/>
         </w:rPr>
       </w:pPr>
+      <w:r>
+        <w:rPr>
+          <w:rFonts w:cs="Times New Roman"/>
+          <w:color w:val="000000" w:themeColor="text1"/>
+          <w:sz w:val="20"/>
+          <w:szCs w:val="20"/>
+        </w:rPr>
+        <w:t>https</w:t>
+      </w:r>
+      <w:r>
+        <w:rPr>
+          <w:rFonts w:cs="Times New Roman"/>
+          <w:color w:val="000000" w:themeColor="text1"/>
+          <w:sz w:val="20"/>
+          <w:szCs w:val="20"/>
+          <w:lang w:val="ru-RU"/>
+        </w:rPr>
+        <w:t>://</w:t>
+      </w:r>
+      <w:r>
+        <w:rPr>
+          <w:rFonts w:cs="Times New Roman"/>
+          <w:color w:val="000000" w:themeColor="text1"/>
+          <w:sz w:val="20"/>
+          <w:szCs w:val="20"/>
+        </w:rPr>
+        <w:t>lab</w:t>
+      </w:r>
+      <w:r>
+        <w:rPr>
+          <w:rFonts w:cs="Times New Roman"/>
+          <w:color w:val="000000" w:themeColor="text1"/>
+          <w:sz w:val="20"/>
+          <w:szCs w:val="20"/>
+          <w:lang w:val="ru-RU"/>
+        </w:rPr>
+        <w:t>2-</w:t>
+      </w:r>
+      <w:r>
+        <w:rPr>
+          <w:rFonts w:cs="Times New Roman"/>
+          <w:color w:val="000000" w:themeColor="text1"/>
+          <w:sz w:val="20"/>
+          <w:szCs w:val="20"/>
+        </w:rPr>
+        <w:t>six</w:t>
+      </w:r>
+      <w:r>
+        <w:rPr>
+          <w:rFonts w:cs="Times New Roman"/>
+          <w:color w:val="000000" w:themeColor="text1"/>
+          <w:sz w:val="20"/>
+          <w:szCs w:val="20"/>
+          <w:lang w:val="ru-RU"/>
+        </w:rPr>
+        <w:t>-</w:t>
+      </w:r>
+      <w:r>
+        <w:rPr>
+          <w:rFonts w:cs="Times New Roman"/>
+          <w:color w:val="000000" w:themeColor="text1"/>
+          <w:sz w:val="20"/>
+          <w:szCs w:val="20"/>
+        </w:rPr>
+        <w:t>sigma</w:t>
+      </w:r>
+      <w:r>
+        <w:rPr>
+          <w:rFonts w:cs="Times New Roman"/>
+          <w:color w:val="000000" w:themeColor="text1"/>
+          <w:sz w:val="20"/>
+          <w:szCs w:val="20"/>
+          <w:lang w:val="ru-RU"/>
+        </w:rPr>
+        <w:t>.</w:t>
+      </w:r>
+      <w:r>
+        <w:rPr>
+          <w:rFonts w:cs="Times New Roman"/>
+          <w:color w:val="000000" w:themeColor="text1"/>
+          <w:sz w:val="20"/>
+          <w:szCs w:val="20"/>
+        </w:rPr>
+        <w:t>vercel</w:t>
+      </w:r>
+      <w:r>
+        <w:rPr>
+          <w:rFonts w:cs="Times New Roman"/>
+          <w:color w:val="000000" w:themeColor="text1"/>
+          <w:sz w:val="20"/>
+          <w:szCs w:val="20"/>
+          <w:lang w:val="ru-RU"/>
+        </w:rPr>
+        <w:t>.</w:t>
+      </w:r>
+      <w:r>
+        <w:rPr>
+          <w:rFonts w:cs="Times New Roman"/>
+          <w:color w:val="000000" w:themeColor="text1"/>
+          <w:sz w:val="20"/>
+          <w:szCs w:val="20"/>
+        </w:rPr>
+        <w:t>app</w:t>
+      </w:r>
     </w:p>
     <w:sectPr>
       <w:pgSz w:w="12240" w:h="15840"/>

</xml_diff>

<commit_message>
edit report in lab 2
</commit_message>
<xml_diff>
--- a/Lab2/Отчет_Лабораторная_2.docx
+++ b/Lab2/Отчет_Лабораторная_2.docx
@@ -531,7 +531,6 @@
           </w:rPr>
           <w:t>.</w:t>
         </w:r>
-        <w:proofErr w:type="spellStart"/>
         <w:r>
           <w:rPr>
             <w:rStyle w:val="aff8"/>
@@ -541,7 +540,6 @@
           </w:rPr>
           <w:t>vercel</w:t>
         </w:r>
-        <w:proofErr w:type="spellEnd"/>
         <w:r>
           <w:rPr>
             <w:rStyle w:val="aff8"/>
@@ -573,72 +571,6 @@
           <w:lang w:val="ru-RU"/>
         </w:rPr>
       </w:pPr>
-      <w:proofErr w:type="spellStart"/>
-      <w:r>
-        <w:rPr>
-          <w:rFonts w:cs="Times New Roman"/>
-          <w:color w:val="000000" w:themeColor="text1"/>
-          <w:sz w:val="20"/>
-          <w:szCs w:val="20"/>
-          <w:lang w:val="ru-RU"/>
-        </w:rPr>
-        <w:t>нвдо</w:t>
-      </w:r>
-      <w:proofErr w:type="spellEnd"/>
-      <w:r>
-        <w:rPr>
-          <w:rFonts w:cs="Times New Roman"/>
-          <w:color w:val="000000" w:themeColor="text1"/>
-          <w:sz w:val="20"/>
-          <w:szCs w:val="20"/>
-          <w:lang w:val="ru-RU"/>
-        </w:rPr>
-        <w:t xml:space="preserve"> из 3 </w:t>
-      </w:r>
-      <w:proofErr w:type="spellStart"/>
-      <w:r>
-        <w:rPr>
-          <w:rFonts w:cs="Times New Roman"/>
-          <w:color w:val="000000" w:themeColor="text1"/>
-          <w:sz w:val="20"/>
-          <w:szCs w:val="20"/>
-          <w:lang w:val="ru-RU"/>
-        </w:rPr>
-        <w:t>лабв</w:t>
-      </w:r>
-      <w:proofErr w:type="spellEnd"/>
-      <w:r>
-        <w:rPr>
-          <w:rFonts w:cs="Times New Roman"/>
-          <w:color w:val="000000" w:themeColor="text1"/>
-          <w:sz w:val="20"/>
-          <w:szCs w:val="20"/>
-          <w:lang w:val="ru-RU"/>
-        </w:rPr>
-        <w:t xml:space="preserve"> методы почитать и подобрать </w:t>
-      </w:r>
-      <w:proofErr w:type="spellStart"/>
-      <w:r>
-        <w:rPr>
-          <w:rFonts w:cs="Times New Roman"/>
-          <w:color w:val="000000" w:themeColor="text1"/>
-          <w:sz w:val="20"/>
-          <w:szCs w:val="20"/>
-          <w:lang w:val="ru-RU"/>
-        </w:rPr>
-        <w:t>хорогие</w:t>
-      </w:r>
-      <w:proofErr w:type="spellEnd"/>
-      <w:r>
-        <w:rPr>
-          <w:rFonts w:cs="Times New Roman"/>
-          <w:color w:val="000000" w:themeColor="text1"/>
-          <w:sz w:val="20"/>
-          <w:szCs w:val="20"/>
-          <w:lang w:val="ru-RU"/>
-        </w:rPr>
-        <w:t xml:space="preserve"> изображения </w:t>
-      </w:r>
     </w:p>
     <w:sectPr>
       <w:pgSz w:w="12240" w:h="15840"/>

</xml_diff>